<commit_message>
Add DVWA citation [29] to thesis document and update all DVWA references
Agent-Logs-Url: https://github.com/azedine91bh/Graduation_Project/sessions/e2a29568-5eff-400f-81a8-32120503b46b

Co-authored-by: azedine91bh <101017746+azedine91bh@users.noreply.github.com>
</commit_message>
<xml_diff>
--- a/论文模板.docx
+++ b/论文模板.docx
@@ -17961,88 +17961,7 @@
         </w:rPr>
       </w:pPr>
       <w:r>
-        <w:rPr>
-          <w:rFonts w:hint="default" w:ascii="Times New Roman" w:hAnsi="Times New Roman" w:cs="Times New Roman"/>
-          <w:b w:val="0"/>
-          <w:bCs w:val="0"/>
-          <w:sz w:val="24"/>
-          <w:szCs w:val="24"/>
-          <w:rtl w:val="0"/>
-        </w:rPr>
-        <w:t xml:space="preserve">Testing Environment: </w:t>
-      </w:r>
-      <w:r>
-        <w:rPr>
-          <w:rFonts w:hint="default" w:ascii="Times New Roman" w:hAnsi="Times New Roman" w:eastAsia="SimSun" w:cs="Times New Roman"/>
-          <w:b w:val="0"/>
-          <w:bCs w:val="0"/>
-          <w:sz w:val="24"/>
-          <w:szCs w:val="24"/>
-        </w:rPr>
-        <w:t xml:space="preserve">The system will be evaluated in controlled environments, specifically using intentionally vulnerable web applications like </w:t>
-      </w:r>
-      <w:r>
-        <w:rPr>
-          <w:rStyle w:val="18"/>
-          <w:rFonts w:hint="default" w:ascii="Times New Roman" w:hAnsi="Times New Roman" w:eastAsia="SimSun" w:cs="Times New Roman"/>
-          <w:b w:val="0"/>
-          <w:bCs w:val="0"/>
-          <w:sz w:val="24"/>
-          <w:szCs w:val="24"/>
-        </w:rPr>
-        <w:t>DVWA (Damn Vulnerable Web Application)</w:t>
-      </w:r>
-      <w:r>
-        <w:rPr>
-          <w:rFonts w:hint="default" w:ascii="Times New Roman" w:hAnsi="Times New Roman" w:eastAsia="SimSun" w:cs="Times New Roman"/>
-          <w:b w:val="0"/>
-          <w:bCs w:val="0"/>
-          <w:sz w:val="24"/>
-          <w:szCs w:val="24"/>
-        </w:rPr>
-        <w:t xml:space="preserve">. These applications provide a safe testing ground with known vulnerabilities for evaluating the scanner's detection capabilities. The focus is on simulating </w:t>
-      </w:r>
-      <w:r>
-        <w:rPr>
-          <w:rStyle w:val="18"/>
-          <w:rFonts w:hint="default" w:ascii="Times New Roman" w:hAnsi="Times New Roman" w:eastAsia="SimSun" w:cs="Times New Roman"/>
-          <w:b w:val="0"/>
-          <w:bCs w:val="0"/>
-          <w:sz w:val="24"/>
-          <w:szCs w:val="24"/>
-        </w:rPr>
-        <w:t>real-world attacks</w:t>
-      </w:r>
-      <w:r>
-        <w:rPr>
-          <w:rFonts w:hint="default" w:ascii="Times New Roman" w:hAnsi="Times New Roman" w:eastAsia="SimSun" w:cs="Times New Roman"/>
-          <w:b w:val="0"/>
-          <w:bCs w:val="0"/>
-          <w:sz w:val="24"/>
-          <w:szCs w:val="24"/>
-        </w:rPr>
-        <w:t xml:space="preserve"> in a controlled, ethical environment. The research does </w:t>
-      </w:r>
-      <w:r>
-        <w:rPr>
-          <w:rStyle w:val="18"/>
-          <w:rFonts w:hint="default" w:ascii="Times New Roman" w:hAnsi="Times New Roman" w:eastAsia="SimSun" w:cs="Times New Roman"/>
-          <w:b w:val="0"/>
-          <w:bCs w:val="0"/>
-          <w:sz w:val="24"/>
-          <w:szCs w:val="24"/>
-        </w:rPr>
-        <w:t>not involve scanning live, production websites</w:t>
-      </w:r>
-      <w:r>
-        <w:rPr>
-          <w:rFonts w:hint="default" w:ascii="Times New Roman" w:hAnsi="Times New Roman" w:eastAsia="SimSun" w:cs="Times New Roman"/>
-          <w:b w:val="0"/>
-          <w:bCs w:val="0"/>
-          <w:sz w:val="24"/>
-          <w:szCs w:val="24"/>
-        </w:rPr>
-        <w:t xml:space="preserve"> without explicit authorization, adhering to legal and ethical guidelines to ensure responsible and secure testing practices.</w:t>
+        <w:t>Testing Environment: The system will be evaluated in controlled environments, specifically using intentionally vulnerable web applications like DVWA (Damn Vulnerable Web Application)[29]. These applications provide a safe testing ground with known vulnerabilities for evaluating the scanner's detection capabilities. The focus is on simulating real-world attacks in a controlled, ethical environment. The research does not involve scanning live, production websites without explicit authorization, adhering to legal and ethical guidelines to ensure responsible and secure testing practices.</w:t>
       </w:r>
     </w:p>
     <w:p>
@@ -18579,14 +18498,7 @@
         </w:rPr>
       </w:pPr>
       <w:r>
-        <w:rPr>
-          <w:rFonts w:hint="default" w:ascii="Times New Roman" w:hAnsi="Times New Roman" w:cs="Times New Roman"/>
-          <w:b w:val="0"/>
-          <w:bCs w:val="0"/>
-          <w:sz w:val="24"/>
-          <w:szCs w:val="24"/>
-        </w:rPr>
-        <w:t>This chapter presents the experimental results of the developed system, focusing on vulnerability detection effectiveness and reporting quality. It includes test scenarios, analysis of scan outputs, and a comparison with existing scanners (for example, OWASP ZAP where applicable). The chapter discusses strengths and limitations based on controlled testing in DVWA (Damn Vulnerable Web Application), including detection behavior, practical usability, and deployment considerations. It also highlights observed constraints such as heuristic false positives/negatives and areas requiring manual verification.</w:t>
+        <w:t>This chapter presents the experimental results of the developed system, focusing on vulnerability detection effectiveness and reporting quality. It includes test scenarios, analysis of scan outputs, and a comparison with existing scanners (for example, OWASP ZAP where applicable). The chapter discusses strengths and limitations based on controlled testing in DVWA (Damn Vulnerable Web Application)[29], including detection behavior, practical usability, and deployment considerations. It also highlights observed constraints such as heuristic false positives/negatives and areas requiring manual verification.</w:t>
       </w:r>
     </w:p>
     <w:p>
@@ -46906,6 +46818,7 @@
         <w:fldChar w:fldCharType="end"/>
       </w:r>
     </w:p>
+    <CT_P/>
     <w:p>
       <w:pPr>
         <w:keepNext w:val="0"/>
@@ -46939,6 +46852,9 @@
           <w:lang w:val="en-US"/>
         </w:rPr>
       </w:pPr>
+      <w:r>
+        <w:t>Mehta V. Damn Vulnerable Web Application (DVWA)[EB/OL]. GitHub, 2026[2026-04-04]. Available: https://github.com/digininja/DVWA.</w:t>
+      </w:r>
     </w:p>
     <w:p>
       <w:pPr>

</xml_diff>